<commit_message>
Second pass: align resume verbs and terminology with essays
Co-Authored-By: Claude Sonnet 5.5 <noreply@anthropic.com>
Claude-Session: https://claude.ai/code/session_01CQFHgEGUEWsGr2fiz5rCwq
</commit_message>
<xml_diff>
--- a/resumes/essay_aligned/CV_Sukwoo_Chung_20261008_1.docx
+++ b/resumes/essay_aligned/CV_Sukwoo_Chung_20261008_1.docx
@@ -475,7 +475,7 @@
           <w:vertAlign w:val="baseline"/>
           <w:rtl w:val="0"/>
         </w:rPr>
-        <w:t xml:space="preserve"> (Jan 2026 – Present) for Samsung Electronics, Samsung affiliates, and external Cello Square customers, raising accuracy of company-wide logistics volume figures and establishing the authoritative dataset referenced across the organization; in January 2026, volumes reported by some branches differed from headquarters figures by as much as 25%</w:t>
+        <w:t xml:space="preserve"> (Jan 2026 – Present) for Samsung Electronics, Samsung affiliates, and external Cello Square customers, raising the reliability of company-wide logistics volume figures and establishing the authoritative dataset referenced across the organization; in January 2026, volumes reported by some branches differed from headquarters figures by as much as 25%</w:t>
       </w:r>
     </w:p>
     <w:p>
@@ -599,7 +599,7 @@
           <w:vertAlign w:val="baseline"/>
           <w:rtl w:val="0"/>
         </w:rPr>
-        <w:t xml:space="preserve">Interviewed operators across 8 departments to understand what each reporting rule was intended to measure; used </w:t>
+        <w:t xml:space="preserve">Interviewed operators across 8 departments to understand what each reporting rule was intended to measure; traced disputed categories to actual shipment events; used </w:t>
       </w:r>
       <w:r>
         <w:rPr>
@@ -637,7 +637,7 @@
           <w:vertAlign w:val="baseline"/>
           <w:rtl w:val="0"/>
         </w:rPr>
-        <w:t xml:space="preserve">, separating reporting-month shifts from genuine errors; redesigned 4 freight-aggregation rules, corrected container conversions and air/ocean double-counting; made an optional less-than-container-load (LCL) field mandatory and added upper-bound checks to address errors at data entry</w:t>
+        <w:t xml:space="preserve">, separating reporting-month shifts from genuine errors; redesigned 4 freight-aggregation rules, corrected container conversions and air/ocean double-counting; traced missing volumes to an optional less-than-container-load (LCL) field and implausibly high values to manual-entry errors, then made the field mandatory and added upper-bound validation checks to address errors at data entry</w:t>
       </w:r>
     </w:p>
     <w:p>
@@ -718,136 +718,136 @@
           <w:vertAlign w:val="baseline"/>
           <w:rtl w:val="0"/>
         </w:rPr>
-        <w:t xml:space="preserve"> across Vessel, Air, Rail, and Truck businesses and reduced the anomalous record rate from 0.80% to 0.56% within two months</w:t>
-      </w:r>
-    </w:p>
-    <w:p>
-      <w:pPr>
-        <w:keepNext w:val="0"/>
-        <w:keepLines w:val="0"/>
-        <w:pageBreakBefore w:val="0"/>
-        <w:widowControl w:val="1"/>
-        <w:numPr>
-          <w:ilvl w:val="0"/>
-          <w:numId w:val="1"/>
-        </w:numPr>
-        <w:pBdr>
-          <w:top w:space="0" w:sz="0" w:val="nil"/>
-          <w:left w:space="0" w:sz="0" w:val="nil"/>
-          <w:bottom w:space="0" w:sz="0" w:val="nil"/>
-          <w:right w:space="0" w:sz="0" w:val="nil"/>
-          <w:between w:space="0" w:sz="0" w:val="nil"/>
-        </w:pBdr>
-        <w:shd w:fill="auto" w:val="clear"/>
-        <w:spacing w:after="30" w:before="0" w:line="260" w:lineRule="auto"/>
-        <w:ind w:left="360" w:right="0" w:hanging="220"/>
-        <w:jc w:val="left"/>
-        <w:rPr/>
-      </w:pPr>
-      <w:r>
-        <w:rPr>
-          <w:rFonts w:ascii="Calibri" w:cs="Calibri" w:eastAsia="Calibri" w:hAnsi="Calibri"/>
-          <w:b w:val="0"/>
-          <w:bCs w:val="0"/>
-          <w:i w:val="0"/>
-          <w:iCs w:val="0"/>
-          <w:smallCaps w:val="0"/>
-          <w:strike w:val="0"/>
-          <w:color w:val="000000"/>
-          <w:sz w:val="22"/>
-          <w:szCs w:val="22"/>
-          <w:u w:val="none"/>
-          <w:shd w:fill="auto" w:val="clear"/>
-          <w:vertAlign w:val="baseline"/>
-          <w:rtl w:val="0"/>
-        </w:rPr>
-        <w:t xml:space="preserve">Partner with Marketing, Settlement, and Sales to analyze the end-to-end logistics dataset; use SQL and Excel daily and automate recurring tasks in Python; deliver Power BI KPI, monitoring, and usage dashboards that turn raw operational data into decision support for the people who must act on it</w:t>
-      </w:r>
-    </w:p>
-    <w:p>
-      <w:pPr>
-        <w:keepNext w:val="0"/>
-        <w:keepLines w:val="0"/>
-        <w:pageBreakBefore w:val="0"/>
-        <w:widowControl w:val="1"/>
-        <w:numPr>
-          <w:ilvl w:val="0"/>
-          <w:numId w:val="1"/>
-        </w:numPr>
-        <w:pBdr>
-          <w:top w:space="0" w:sz="0" w:val="nil"/>
-          <w:left w:space="0" w:sz="0" w:val="nil"/>
-          <w:bottom w:space="0" w:sz="0" w:val="nil"/>
-          <w:right w:space="0" w:sz="0" w:val="nil"/>
-          <w:between w:space="0" w:sz="0" w:val="nil"/>
-        </w:pBdr>
-        <w:shd w:fill="auto" w:val="clear"/>
-        <w:spacing w:after="30" w:before="0" w:line="260" w:lineRule="auto"/>
-        <w:ind w:left="360" w:right="0" w:hanging="220"/>
-        <w:jc w:val="left"/>
-        <w:rPr/>
-      </w:pPr>
-      <w:r>
-        <w:rPr>
-          <w:rFonts w:ascii="Calibri" w:cs="Calibri" w:eastAsia="Calibri" w:hAnsi="Calibri"/>
-          <w:b w:val="0"/>
-          <w:bCs w:val="0"/>
-          <w:i w:val="0"/>
-          <w:iCs w:val="0"/>
-          <w:smallCaps w:val="0"/>
-          <w:strike w:val="0"/>
-          <w:color w:val="000000"/>
-          <w:sz w:val="22"/>
-          <w:szCs w:val="22"/>
-          <w:u w:val="none"/>
-          <w:shd w:fill="auto" w:val="clear"/>
-          <w:vertAlign w:val="baseline"/>
-          <w:rtl w:val="0"/>
-        </w:rPr>
-        <w:t xml:space="preserve">Combine Google Analytics 4 and Google Tag Manager with internal behavioral data to build funnel and behavior analyses of Cello Square members; identify drop-off points and eliminate unnecessary pages to converge on an optimal user flow</w:t>
-      </w:r>
-    </w:p>
-    <w:p>
-      <w:pPr>
-        <w:keepNext w:val="0"/>
-        <w:keepLines w:val="0"/>
-        <w:pageBreakBefore w:val="0"/>
-        <w:widowControl w:val="1"/>
-        <w:numPr>
-          <w:ilvl w:val="0"/>
-          <w:numId w:val="1"/>
-        </w:numPr>
-        <w:pBdr>
-          <w:top w:space="0" w:sz="0" w:val="nil"/>
-          <w:left w:space="0" w:sz="0" w:val="nil"/>
-          <w:bottom w:space="0" w:sz="0" w:val="nil"/>
-          <w:right w:space="0" w:sz="0" w:val="nil"/>
-          <w:between w:space="0" w:sz="0" w:val="nil"/>
-        </w:pBdr>
-        <w:shd w:fill="auto" w:val="clear"/>
-        <w:spacing w:after="30" w:before="0" w:line="260" w:lineRule="auto"/>
-        <w:ind w:left="360" w:right="0" w:hanging="220"/>
-        <w:jc w:val="left"/>
-        <w:rPr/>
-      </w:pPr>
-      <w:r>
-        <w:rPr>
-          <w:rFonts w:ascii="Calibri" w:cs="Calibri" w:eastAsia="Calibri" w:hAnsi="Calibri"/>
-          <w:b w:val="0"/>
-          <w:bCs w:val="0"/>
-          <w:i w:val="0"/>
-          <w:iCs w:val="0"/>
-          <w:smallCaps w:val="0"/>
-          <w:strike w:val="0"/>
-          <w:color w:val="000000"/>
-          <w:sz w:val="22"/>
-          <w:szCs w:val="22"/>
-          <w:u w:val="none"/>
-          <w:shd w:fill="auto" w:val="clear"/>
-          <w:vertAlign w:val="baseline"/>
-          <w:rtl w:val="0"/>
-        </w:rPr>
-        <w:t xml:space="preserve">Drive a cosmetics-focused express (small-parcel) analytics initiative targeting Korea-outbound demand to the U.S. and Japan; enable customized service, discount targeting, bespoke customer dashboards, and retention tracking</w:t>
+        <w:t xml:space="preserve"> across Vessel, Air, Rail, and Truck businesses and reduced the anomalous record rate from 0.80% to 0.56% within two months, giving regional teams a shared basis to investigate discrepancies against agreed definitions rather than competing totals</w:t>
+      </w:r>
+    </w:p>
+    <w:p>
+      <w:pPr>
+        <w:keepNext w:val="0"/>
+        <w:keepLines w:val="0"/>
+        <w:pageBreakBefore w:val="0"/>
+        <w:widowControl w:val="1"/>
+        <w:numPr>
+          <w:ilvl w:val="0"/>
+          <w:numId w:val="1"/>
+        </w:numPr>
+        <w:pBdr>
+          <w:top w:space="0" w:sz="0" w:val="nil"/>
+          <w:left w:space="0" w:sz="0" w:val="nil"/>
+          <w:bottom w:space="0" w:sz="0" w:val="nil"/>
+          <w:right w:space="0" w:sz="0" w:val="nil"/>
+          <w:between w:space="0" w:sz="0" w:val="nil"/>
+        </w:pBdr>
+        <w:shd w:fill="auto" w:val="clear"/>
+        <w:spacing w:after="30" w:before="0" w:line="260" w:lineRule="auto"/>
+        <w:ind w:left="360" w:right="0" w:hanging="220"/>
+        <w:jc w:val="left"/>
+        <w:rPr/>
+      </w:pPr>
+      <w:r>
+        <w:rPr>
+          <w:rFonts w:ascii="Calibri" w:cs="Calibri" w:eastAsia="Calibri" w:hAnsi="Calibri"/>
+          <w:b w:val="0"/>
+          <w:bCs w:val="0"/>
+          <w:i w:val="0"/>
+          <w:iCs w:val="0"/>
+          <w:smallCaps w:val="0"/>
+          <w:strike w:val="0"/>
+          <w:color w:val="000000"/>
+          <w:sz w:val="22"/>
+          <w:szCs w:val="22"/>
+          <w:u w:val="none"/>
+          <w:shd w:fill="auto" w:val="clear"/>
+          <w:vertAlign w:val="baseline"/>
+          <w:rtl w:val="0"/>
+        </w:rPr>
+        <w:t xml:space="preserve">Collaborate with Marketing, Settlement, and Sales to analyze the end-to-end logistics dataset; use SQL and Excel daily and automate recurring tasks in Python; deliver Power BI KPI, monitoring, and usage dashboards that turn raw operational data into decision support for the people who must act on it</w:t>
+      </w:r>
+    </w:p>
+    <w:p>
+      <w:pPr>
+        <w:keepNext w:val="0"/>
+        <w:keepLines w:val="0"/>
+        <w:pageBreakBefore w:val="0"/>
+        <w:widowControl w:val="1"/>
+        <w:numPr>
+          <w:ilvl w:val="0"/>
+          <w:numId w:val="1"/>
+        </w:numPr>
+        <w:pBdr>
+          <w:top w:space="0" w:sz="0" w:val="nil"/>
+          <w:left w:space="0" w:sz="0" w:val="nil"/>
+          <w:bottom w:space="0" w:sz="0" w:val="nil"/>
+          <w:right w:space="0" w:sz="0" w:val="nil"/>
+          <w:between w:space="0" w:sz="0" w:val="nil"/>
+        </w:pBdr>
+        <w:shd w:fill="auto" w:val="clear"/>
+        <w:spacing w:after="30" w:before="0" w:line="260" w:lineRule="auto"/>
+        <w:ind w:left="360" w:right="0" w:hanging="220"/>
+        <w:jc w:val="left"/>
+        <w:rPr/>
+      </w:pPr>
+      <w:r>
+        <w:rPr>
+          <w:rFonts w:ascii="Calibri" w:cs="Calibri" w:eastAsia="Calibri" w:hAnsi="Calibri"/>
+          <w:b w:val="0"/>
+          <w:bCs w:val="0"/>
+          <w:i w:val="0"/>
+          <w:iCs w:val="0"/>
+          <w:smallCaps w:val="0"/>
+          <w:strike w:val="0"/>
+          <w:color w:val="000000"/>
+          <w:sz w:val="22"/>
+          <w:szCs w:val="22"/>
+          <w:u w:val="none"/>
+          <w:shd w:fill="auto" w:val="clear"/>
+          <w:vertAlign w:val="baseline"/>
+          <w:rtl w:val="0"/>
+        </w:rPr>
+        <w:t xml:space="preserve">Develop funnel and behavior analyses of Cello Square members by combining Google Analytics 4 and Google Tag Manager with internal behavioral data; identify drop-off points and eliminate unnecessary pages to converge on an optimal user flow</w:t>
+      </w:r>
+    </w:p>
+    <w:p>
+      <w:pPr>
+        <w:keepNext w:val="0"/>
+        <w:keepLines w:val="0"/>
+        <w:pageBreakBefore w:val="0"/>
+        <w:widowControl w:val="1"/>
+        <w:numPr>
+          <w:ilvl w:val="0"/>
+          <w:numId w:val="1"/>
+        </w:numPr>
+        <w:pBdr>
+          <w:top w:space="0" w:sz="0" w:val="nil"/>
+          <w:left w:space="0" w:sz="0" w:val="nil"/>
+          <w:bottom w:space="0" w:sz="0" w:val="nil"/>
+          <w:right w:space="0" w:sz="0" w:val="nil"/>
+          <w:between w:space="0" w:sz="0" w:val="nil"/>
+        </w:pBdr>
+        <w:shd w:fill="auto" w:val="clear"/>
+        <w:spacing w:after="30" w:before="0" w:line="260" w:lineRule="auto"/>
+        <w:ind w:left="360" w:right="0" w:hanging="220"/>
+        <w:jc w:val="left"/>
+        <w:rPr/>
+      </w:pPr>
+      <w:r>
+        <w:rPr>
+          <w:rFonts w:ascii="Calibri" w:cs="Calibri" w:eastAsia="Calibri" w:hAnsi="Calibri"/>
+          <w:b w:val="0"/>
+          <w:bCs w:val="0"/>
+          <w:i w:val="0"/>
+          <w:iCs w:val="0"/>
+          <w:smallCaps w:val="0"/>
+          <w:strike w:val="0"/>
+          <w:color w:val="000000"/>
+          <w:sz w:val="22"/>
+          <w:szCs w:val="22"/>
+          <w:u w:val="none"/>
+          <w:shd w:fill="auto" w:val="clear"/>
+          <w:vertAlign w:val="baseline"/>
+          <w:rtl w:val="0"/>
+        </w:rPr>
+        <w:t xml:space="preserve">Develop a cosmetics-focused express (small-parcel) analytics initiative targeting Korea-outbound demand to the U.S. and Japan; enable customized service, discount targeting, bespoke customer dashboards, and retention tracking</w:t>
       </w:r>
     </w:p>
     <w:p>
@@ -977,26 +977,26 @@
           <w:vertAlign w:val="baseline"/>
           <w:rtl w:val="0"/>
         </w:rPr>
-        <w:t xml:space="preserve">Served as </w:t>
-      </w:r>
-      <w:r>
-        <w:rPr>
-          <w:rFonts w:ascii="Calibri" w:cs="Calibri" w:eastAsia="Calibri" w:hAnsi="Calibri"/>
-          <w:b w:val="1"/>
-          <w:bCs w:val="1"/>
-          <w:i w:val="0"/>
-          <w:iCs w:val="0"/>
-          <w:smallCaps w:val="0"/>
-          <w:strike w:val="0"/>
-          <w:color w:val="000000"/>
-          <w:sz w:val="22"/>
-          <w:szCs w:val="22"/>
-          <w:u w:val="none"/>
-          <w:shd w:fill="auto" w:val="clear"/>
-          <w:vertAlign w:val="baseline"/>
-          <w:rtl w:val="0"/>
-        </w:rPr>
-        <w:t xml:space="preserve">Project Manager for the 17-month Group Sales Optimizer (GSO) project</w:t>
+        <w:t xml:space="preserve">Managed the 17-month </w:t>
+      </w:r>
+      <w:r>
+        <w:rPr>
+          <w:rFonts w:ascii="Calibri" w:cs="Calibri" w:eastAsia="Calibri" w:hAnsi="Calibri"/>
+          <w:b w:val="1"/>
+          <w:bCs w:val="1"/>
+          <w:i w:val="0"/>
+          <w:iCs w:val="0"/>
+          <w:smallCaps w:val="0"/>
+          <w:strike w:val="0"/>
+          <w:color w:val="000000"/>
+          <w:sz w:val="22"/>
+          <w:szCs w:val="22"/>
+          <w:u w:val="none"/>
+          <w:shd w:fill="auto" w:val="clear"/>
+          <w:vertAlign w:val="baseline"/>
+          <w:rtl w:val="0"/>
+        </w:rPr>
+        <w:t xml:space="preserve">Group Sales Optimizer (GSO) project</w:t>
       </w:r>
       <w:r>
         <w:rPr>
@@ -1220,7 +1220,7 @@
           <w:vertAlign w:val="baseline"/>
           <w:rtl w:val="0"/>
         </w:rPr>
-        <w:t xml:space="preserve">Built the </w:t>
+        <w:t xml:space="preserve">Developed the </w:t>
       </w:r>
       <w:r>
         <w:rPr>
@@ -1258,7 +1258,7 @@
           <w:vertAlign w:val="baseline"/>
           <w:rtl w:val="0"/>
         </w:rPr>
-        <w:t xml:space="preserve"> (SQL, Tableau) — translated suspicious booking behavior into concrete query rules and presented cases for sales teams to investigate; flagged </w:t>
+        <w:t xml:space="preserve"> (SQL, Tableau) — translated suspicious booking behavior into concrete query rules and presented cases for sales teams to investigate, rendering findings actionable; flagged </w:t>
       </w:r>
       <w:r>
         <w:rPr>
@@ -1912,7 +1912,7 @@
           <w:vertAlign w:val="baseline"/>
           <w:rtl w:val="0"/>
         </w:rPr>
-        <w:t xml:space="preserve">Owned operation of the passenger </w:t>
+        <w:t xml:space="preserve">Operated the passenger </w:t>
       </w:r>
       <w:r>
         <w:rPr>
@@ -2141,7 +2141,7 @@
           <w:vertAlign w:val="baseline"/>
           <w:rtl w:val="0"/>
         </w:rPr>
-        <w:t xml:space="preserve">Built the Availability DB and price-tracking database for Expedia and Skyscanner via SQL/Python, enabling near-real-time competitive-pricing visibility</w:t>
+        <w:t xml:space="preserve">Developed the Availability DB and price-tracking database for Expedia and Skyscanner via SQL/Python, enabling near-real-time competitive-pricing visibility</w:t>
       </w:r>
     </w:p>
     <w:p>
@@ -2521,7 +2521,7 @@
           <w:vertAlign w:val="baseline"/>
           <w:rtl w:val="0"/>
         </w:rPr>
-        <w:t xml:space="preserve">Built the ticket-price monitoring tool by accumulating online-searched fares into a dataset and visualizing it via Tableau and Oracle BI; supported the Tableau adoption decision through comparative evaluation of visualization tools</w:t>
+        <w:t xml:space="preserve">Developed the ticket-price monitoring tool by accumulating online-searched fares into a dataset and visualizing it via Tableau and Oracle BI; supported the Tableau adoption decision through comparative evaluation of visualization tools</w:t>
       </w:r>
     </w:p>
     <w:p>
@@ -2791,7 +2791,7 @@
           <w:vertAlign w:val="baseline"/>
           <w:rtl w:val="0"/>
         </w:rPr>
-        <w:t xml:space="preserve">Owned the Mode Tour account — allocating aircraft seats, negotiating ticket pricing, and coordinating group inventory for package tours</w:t>
+        <w:t xml:space="preserve">Managed the Mode Tour account — allocating aircraft seats, negotiating ticket pricing, and coordinating group inventory for package tours</w:t>
       </w:r>
     </w:p>
     <w:p>

</xml_diff>